<commit_message>
Geboortedatum beslist: 01/01/1900 voor iedereen
Novel maakt naam en geboortedatum verplicht omdat de software voor klinische
dossiers gebouwd is. De PI beslist vandaag dat daar een vaste dummydatum in
gaat, voor elke deelnemer dezelfde, naast de X in beide naamvelden.

Een gevolg dat het vermelden waard is: het veld Age in Visits wordt uit de
geboortedatum berekend en komt daarmee op 126 uit. Dat is geen fout maar het
zichtbare teken dat er geen echte geboortedatum in staat -- wie de database
opent, ziet meteen dat dit een plaatshouder is en niet per ongeluk een leeg
gelaten veld. De werkelijke leeftijd staat in de eCRF. Dat staat er nu bij,
zodat niemand het later gaat 'verbeteren'.

Het openstaande punt hierover vervalt in de SOP, in de tijdlijn en in de
afvinklijst.

Co-Authored-By: Claude Opus 5 <noreply@anthropic.com>
</commit_message>
<xml_diff>
--- a/(e)CRF/Per nummer/09b_Werkinstructie drukmeting (SOP Novel pedar).docx
+++ b/(e)CRF/Per nummer/09b_Werkinstructie drukmeting (SOP Novel pedar).docx
@@ -2893,7 +2893,20 @@
           <w:i w:val="0"/>
           <w:sz w:val="22"/>
         </w:rPr>
-        <w:t>Vul bij ID en External ID de deelnemerscode in. De velden First name en Last name krijgen een X: de database is gebouwd voor klinische dossiers en vraagt een naam, maar in de studie hoort daar geen naam in. Vul ook geen adres, telefoonnummer of beroep in.</w:t>
+        <w:t>Vul bij ID en External ID de deelnemerscode in. De velden First name en Last name krijgen een X, en Date of birth krijgt 01/01/1900. De database is gebouwd voor klinische dossiers en vraagt naam en geboortedatum, maar in de studie hoort daar niets herleidbaars in. Vul ook geen adres, telefoonnummer of beroep in.</w:t>
+      </w:r>
+    </w:p>
+    <w:p>
+      <w:pPr>
+        <w:ind w:left="340"/>
+      </w:pPr>
+      <w:r>
+        <w:rPr>
+          <w:b w:val="0"/>
+          <w:i/>
+          <w:sz w:val="22"/>
+        </w:rPr>
+        <w:t>Dezelfde 01/01/1900 voor élke deelnemer. Het veld Age in Visits rekent daarop verder en komt dus op 126 uit — dat is geen fout, maar het teken dat er geen echte geboortedatum in staat. De werkelijke leeftijd staat in de eCRF.</w:t>
       </w:r>
     </w:p>
     <w:p>
@@ -3954,20 +3967,6 @@
         <w:t xml:space="preserve">10. </w:t>
       </w:r>
       <w:r>
-        <w:t>Of het veld Date of birth in de database ingevuld wordt. Novel vraagt het, maar een geboortedatum is samen met een centrum en een meetdatum herleidbaar. Overweeg alleen het geboortejaar, of het veld leeg laten.</w:t>
-      </w:r>
-    </w:p>
-    <w:p>
-      <w:pPr>
-        <w:ind w:left="397" w:hanging="397"/>
-      </w:pPr>
-      <w:r>
-        <w:rPr>
-          <w:b/>
-        </w:rPr>
-        <w:t xml:space="preserve">11. </w:t>
-      </w:r>
-      <w:r>
         <w:t>Wat te doen als het ook na herhalen niet lukt: een deelnemer die de tien meter niet aan één stuk haalt, of die na drie doorgangen nog geen 12 bruikbare stappen per voet levert. Meten met minder, of noteren als niet meetbaar?</w:t>
       </w:r>
     </w:p>

</xml_diff>

<commit_message>
Twee dingen uit de eindlezing
'Er wordt gemeten in het binnenschoeisel' gold te breed. Op visite 1 is er nog
geen studieschoeisel -- daar meet je in de schoenen waarmee de deelnemer
binnenkomt. Dat staat er nu bij; vanaf visite 2 is het het binnenschoeisel.

En stap 36 vroeg de drie hoogste piekdrukwaarden, terwijl de alinea eronder
over de drie doelregio's gaat. Die twee staan vlak na elkaar en zijn niet
hetzelfde: de regio met de vorige voetzweer telt altijd mee als doelregio, ook
als ze niet bij de hoogste drie zit. Dat verschil staat er nu expliciet.

Co-Authored-By: Claude Opus 5 <noreply@anthropic.com>
</commit_message>
<xml_diff>
--- a/(e)CRF/Per nummer/09b_Werkinstructie drukmeting (SOP Novel pedar).docx
+++ b/(e)CRF/Per nummer/09b_Werkinstructie drukmeting (SOP Novel pedar).docx
@@ -1790,7 +1790,26 @@
           <w:i w:val="0"/>
           <w:sz w:val="22"/>
         </w:rPr>
-        <w:t>Er wordt gemeten in het bínnenschoeisel. Eén paar, twee condities, in deze volgorde:</w:t>
+        <w:t>Vanaf visite 2 wordt gemeten in het binnenschoeisel — één paar, geen tweede. Op visite 1 is er nog geen studieschoeisel: dan meet je in de schoenen waarmee de deelnemer binnenkomt.</w:t>
+      </w:r>
+    </w:p>
+    <w:p>
+      <w:r>
+        <w:rPr>
+          <w:b w:val="0"/>
+          <w:i w:val="0"/>
+          <w:sz w:val="22"/>
+        </w:rPr>
+      </w:r>
+    </w:p>
+    <w:p>
+      <w:r>
+        <w:rPr>
+          <w:b/>
+          <w:i w:val="0"/>
+          <w:sz w:val="22"/>
+        </w:rPr>
+        <w:t>Twee condities, in deze volgorde:</w:t>
       </w:r>
     </w:p>
     <w:p>
@@ -2180,7 +2199,7 @@
         <w:t xml:space="preserve">36. </w:t>
       </w:r>
       <w:r>
-        <w:t>Noteer de drie hoogste piekdrukwaarden en waar op de voet ze liggen. Het palet is zo ingesteld dat alles wat de topkleur haalt op of boven de norm van 200 kPa ligt — je ziet dus in één oogopslag welke plekken eruit springen. Beschrijf de plaats met de regio-indeling van het protocol: hiel, mediale middenvoet, laterale middenvoet, metatarsaal 1, metatarsaal 2-3, metatarsaal 4-5, hallux, tenen 2-5.</w:t>
+        <w:t>Noteer de drie hoogste piekdrukwaarden van dit beeld en waar op de voet ze liggen. Het palet is zo ingesteld dat alles wat de topkleur haalt op of boven de norm van 200 kPa ligt — je ziet dus in één oogopslag welke plekken eruit springen. Beschrijf de plaats met de regio-indeling van het protocol: hiel, mediale middenvoet, laterale middenvoet, metatarsaal 1, metatarsaal 2-3, metatarsaal 4-5, hallux, tenen 2-5.</w:t>
       </w:r>
     </w:p>
     <w:p>
@@ -2205,6 +2224,16 @@
           <w:sz w:val="22"/>
         </w:rPr>
         <w:t>De norm: piekdruk onder 200 kPa mét de zool, óf minstens 25% lager dan dezelfde regio zonder de zool in dezelfde sessie. Gehaald op alle drie de doelregio’s? Dan is de zool in orde. Zo niet: laat de pedorthist aanpassen en meet opnieuw.</w:t>
+      </w:r>
+    </w:p>
+    <w:p>
+      <w:r>
+        <w:rPr>
+          <w:b/>
+          <w:i w:val="0"/>
+          <w:sz w:val="22"/>
+        </w:rPr>
+        <w:t>Let op het verschil: de drie hoogste waarden uit stap 36 zijn wat je in dit beeld ziet; de drie doelregio’s zijn wat er ontlast moet worden. Die twee overlappen meestal, maar niet altijd — de regio met de vorige voetzweer telt altijd mee, ook als ze niet bij de hoogste drie zit.</w:t>
       </w:r>
     </w:p>
     <w:p>

</xml_diff>

<commit_message>
SOP wijst nu naar het blad 'Meting', en twee punten zijn ingehaald
Stap 35, 36 en 37 zeggen nu in welk blok van het blad 'Meting' iets hoort, en
hoofdstuk 12 opent met een tabelletje dat de zeven blokken opsomt. Een
clinicus hoeft dus niet te raden waar de vier waarden, de drie hoogste
piekdrukken of de schermafbeelding naartoe gaan.

Twee openstaande punten zijn achterhaald door het werk van vandaag. Dat over
de kolomtitel 'Barefoot' is opgelost -- het opschrift is vervangen -- en wat
overblijft is alleen nog het blad 'Visit' dat op zes regio's staat; dat punt
zegt nu ook dat het blad 'Meting' de acht al heeft. En de vraag wat er gebeurt
als een deelnemer maar een paar schoeisel heeft vervalt: er wordt enkel in het
binnenschoeisel gemeten en deel A1 is uit eCRF 24.

Van tien openstaande punten blijven er zeven over.

Co-Authored-By: Claude Opus 5 <noreply@anthropic.com>
</commit_message>
<xml_diff>
--- a/(e)CRF/Per nummer/09b_Werkinstructie drukmeting (SOP Novel pedar).docx
+++ b/(e)CRF/Per nummer/09b_Werkinstructie drukmeting (SOP Novel pedar).docx
@@ -2185,7 +2185,7 @@
         <w:t xml:space="preserve">35. </w:t>
       </w:r>
       <w:r>
-        <w:t>Lees onderaan per voet af: Maximum force, Peak pressure, Average pressure en Loaded area. Noteer ze op het formulier.</w:t>
+        <w:t>Lees onderaan per voet af: Maximum force, Peak pressure, Average pressure en Loaded area. Noteer ze in blok 3 van het blad ‘Meting’.</w:t>
       </w:r>
     </w:p>
     <w:p>
@@ -2199,7 +2199,7 @@
         <w:t xml:space="preserve">36. </w:t>
       </w:r>
       <w:r>
-        <w:t>Noteer de drie hoogste piekdrukwaarden van dit beeld en waar op de voet ze liggen. Het palet is zo ingesteld dat alles wat de topkleur haalt op of boven de norm van 200 kPa ligt — je ziet dus in één oogopslag welke plekken eruit springen. Beschrijf de plaats met de regio-indeling van het protocol: hiel, mediale middenvoet, laterale middenvoet, metatarsaal 1, metatarsaal 2-3, metatarsaal 4-5, hallux, tenen 2-5.</w:t>
+        <w:t>Noteer de drie hoogste piekdrukwaarden van dit beeld en waar op de voet ze liggen, in blok 4 van het blad ‘Meting’. Het palet is zo ingesteld dat alles wat de topkleur haalt op of boven de norm van 200 kPa ligt — je ziet dus in één oogopslag welke plekken eruit springen. Beschrijf de plaats met de regio-indeling van het protocol: hiel, mediale middenvoet, laterale middenvoet, metatarsaal 1, metatarsaal 2-3, metatarsaal 4-5, hallux, tenen 2-5.</w:t>
       </w:r>
     </w:p>
     <w:p>
@@ -2213,7 +2213,7 @@
         <w:t xml:space="preserve">37. </w:t>
       </w:r>
       <w:r>
-        <w:t>Maak een schermafbeelding van het MPP-beeld, met de kleurenschaal zichtbaar, en plak die in de Pressure Monitoring Tool bij deze deelnemer en dit meetmoment. Gebruik Windows-toets + Shift + S, sleep een kader rond het voetbeeld én de kleurenschaal, en plak met Ctrl + V in de Excel. Zo ligt de beoordeling vast in beeld naast de cijfers.</w:t>
+        <w:t>Maak een schermafbeelding van het MPP-beeld, met de kleurenschaal zichtbaar, en plak die in blok 6 van het blad ‘Meting’, in het vak van de juiste conditie. Gebruik Windows-toets + Shift + S, sleep een kader rond het voetbeeld én de kleurenschaal, en plak met Ctrl + V in de Excel. Zo ligt de beoordeling vast in beeld naast de cijfers.</w:t>
       </w:r>
     </w:p>
     <w:p>
@@ -2412,6 +2412,243 @@
         <w:t>12. Opslaan en afronden</w:t>
       </w:r>
     </w:p>
+    <w:p>
+      <w:r>
+        <w:rPr>
+          <w:b/>
+          <w:i w:val="0"/>
+          <w:sz w:val="22"/>
+        </w:rPr>
+        <w:t>Alles wat je noteert gaat op één blad: ‘Meting’ in de Pressure Monitoring Tool. De blokken staan in de volgorde van de meting.</w:t>
+      </w:r>
+    </w:p>
+    <w:tbl>
+      <w:tblPr>
+        <w:tblStyle w:val="TableGrid"/>
+        <w:tblW w:type="auto" w:w="0"/>
+        <w:jc w:val="left"/>
+        <w:tblLook w:firstColumn="1" w:firstRow="1" w:lastColumn="0" w:lastRow="0" w:noHBand="0" w:noVBand="1" w:val="04A0"/>
+      </w:tblPr>
+      <w:tblGrid>
+        <w:gridCol w:w="4513"/>
+        <w:gridCol w:w="4513"/>
+      </w:tblGrid>
+      <w:tr>
+        <w:tc>
+          <w:tcPr>
+            <w:tcW w:type="dxa" w:w="1247"/>
+          </w:tcPr>
+          <w:p>
+            <w:r/>
+            <w:r>
+              <w:rPr>
+                <w:b/>
+                <w:color w:val="123A5F"/>
+                <w:sz w:val="20"/>
+              </w:rPr>
+              <w:t>Blok</w:t>
+            </w:r>
+          </w:p>
+        </w:tc>
+        <w:tc>
+          <w:tcPr>
+            <w:tcW w:type="dxa" w:w="7540"/>
+          </w:tcPr>
+          <w:p>
+            <w:r/>
+            <w:r>
+              <w:rPr>
+                <w:b/>
+                <w:color w:val="123A5F"/>
+                <w:sz w:val="20"/>
+              </w:rPr>
+              <w:t>Wat erin komt</w:t>
+            </w:r>
+          </w:p>
+        </w:tc>
+      </w:tr>
+      <w:tr>
+        <w:tc>
+          <w:tcPr>
+            <w:tcW w:type="dxa" w:w="1247"/>
+          </w:tcPr>
+          <w:p>
+            <w:r/>
+            <w:r>
+              <w:rPr>
+                <w:sz w:val="20"/>
+              </w:rPr>
+              <w:t>1 en 2</w:t>
+            </w:r>
+          </w:p>
+        </w:tc>
+        <w:tc>
+          <w:tcPr>
+            <w:tcW w:type="dxa" w:w="7540"/>
+          </w:tcPr>
+          <w:p>
+            <w:r/>
+            <w:r>
+              <w:rPr>
+                <w:sz w:val="20"/>
+              </w:rPr>
+              <w:t>Deelnemer, visite, datum, zoolcodes, batterij en configuratiebestand</w:t>
+            </w:r>
+          </w:p>
+        </w:tc>
+      </w:tr>
+      <w:tr>
+        <w:tc>
+          <w:tcPr>
+            <w:tcW w:type="dxa" w:w="1247"/>
+          </w:tcPr>
+          <w:p>
+            <w:r/>
+            <w:r>
+              <w:rPr>
+                <w:sz w:val="20"/>
+              </w:rPr>
+              <w:t>3</w:t>
+            </w:r>
+          </w:p>
+        </w:tc>
+        <w:tc>
+          <w:tcPr>
+            <w:tcW w:type="dxa" w:w="7540"/>
+          </w:tcPr>
+          <w:p>
+            <w:r/>
+            <w:r>
+              <w:rPr>
+                <w:sz w:val="20"/>
+              </w:rPr>
+              <w:t>De vier waarden per voet, voor conditie A en B</w:t>
+            </w:r>
+          </w:p>
+        </w:tc>
+      </w:tr>
+      <w:tr>
+        <w:tc>
+          <w:tcPr>
+            <w:tcW w:type="dxa" w:w="1247"/>
+          </w:tcPr>
+          <w:p>
+            <w:r/>
+            <w:r>
+              <w:rPr>
+                <w:sz w:val="20"/>
+              </w:rPr>
+              <w:t>4</w:t>
+            </w:r>
+          </w:p>
+        </w:tc>
+        <w:tc>
+          <w:tcPr>
+            <w:tcW w:type="dxa" w:w="7540"/>
+          </w:tcPr>
+          <w:p>
+            <w:r/>
+            <w:r>
+              <w:rPr>
+                <w:sz w:val="20"/>
+              </w:rPr>
+              <w:t>De drie hoogste piekdrukken per voet, met hun plaats — de kolommen ‘% verschil’ en ‘Norm gehaald?’ rekenen zelf</w:t>
+            </w:r>
+          </w:p>
+        </w:tc>
+      </w:tr>
+      <w:tr>
+        <w:tc>
+          <w:tcPr>
+            <w:tcW w:type="dxa" w:w="1247"/>
+          </w:tcPr>
+          <w:p>
+            <w:r/>
+            <w:r>
+              <w:rPr>
+                <w:sz w:val="20"/>
+              </w:rPr>
+              <w:t>5</w:t>
+            </w:r>
+          </w:p>
+        </w:tc>
+        <w:tc>
+          <w:tcPr>
+            <w:tcW w:type="dxa" w:w="7540"/>
+          </w:tcPr>
+          <w:p>
+            <w:r/>
+            <w:r>
+              <w:rPr>
+                <w:sz w:val="20"/>
+              </w:rPr>
+              <w:t>De drie doelregio’s, en of de druk sinds de vorige keer met 5% of meer gestegen is</w:t>
+            </w:r>
+          </w:p>
+        </w:tc>
+      </w:tr>
+      <w:tr>
+        <w:tc>
+          <w:tcPr>
+            <w:tcW w:type="dxa" w:w="1247"/>
+          </w:tcPr>
+          <w:p>
+            <w:r/>
+            <w:r>
+              <w:rPr>
+                <w:sz w:val="20"/>
+              </w:rPr>
+              <w:t>6</w:t>
+            </w:r>
+          </w:p>
+        </w:tc>
+        <w:tc>
+          <w:tcPr>
+            <w:tcW w:type="dxa" w:w="7540"/>
+          </w:tcPr>
+          <w:p>
+            <w:r/>
+            <w:r>
+              <w:rPr>
+                <w:sz w:val="20"/>
+              </w:rPr>
+              <w:t>De twee schermafbeeldingen</w:t>
+            </w:r>
+          </w:p>
+        </w:tc>
+      </w:tr>
+      <w:tr>
+        <w:tc>
+          <w:tcPr>
+            <w:tcW w:type="dxa" w:w="1247"/>
+          </w:tcPr>
+          <w:p>
+            <w:r/>
+            <w:r>
+              <w:rPr>
+                <w:sz w:val="20"/>
+              </w:rPr>
+              <w:t>7</w:t>
+            </w:r>
+          </w:p>
+        </w:tc>
+        <w:tc>
+          <w:tcPr>
+            <w:tcW w:type="dxa" w:w="7540"/>
+          </w:tcPr>
+          <w:p>
+            <w:r/>
+            <w:r>
+              <w:rPr>
+                <w:sz w:val="20"/>
+              </w:rPr>
+              <w:t>Blijft leeg tot het masker met de acht regio’s er is</w:t>
+            </w:r>
+          </w:p>
+        </w:tc>
+      </w:tr>
+    </w:tbl>
+    <w:p/>
     <w:p>
       <w:pPr>
         <w:ind w:left="397" w:hanging="397"/>
@@ -3978,7 +4215,7 @@
         <w:t xml:space="preserve">5. </w:t>
       </w:r>
       <w:r>
-        <w:t>De Pressure Monitoring Tool kent zes regio’s per voet in plaats van acht: de middenvoet is niet gesplitst in mediaal en lateraal en tenen 2-5 ontbreken. Dat geldt voor het overzicht, voor de twee blokken waar de ruwe export in geplakt wordt én voor de twee grafieken. Hangt samen met het masker: dat moet zestien velden opleveren, niet twaalf. De kolomtitel ‘Barefoot’ moet ook nog wijzigen — bedoeld is de meting zónder aangepaste zool.</w:t>
+        <w:t>Het blad ‘Visit’ van de Pressure Monitoring Tool kent nog zes regio’s per voet in plaats van acht: de middenvoet is niet gesplitst en tenen 2-5 ontbreken. Dat geldt voor het overzicht, voor de twee blokken waar de ruwe export in geplakt wordt én voor de hulpkolommen waar de grafieken uit lezen. Pas om te bouwen zodra het masker de zestien velden A tot P oplevert — anders twee keer werk. Het blad ‘Meting’ heeft de acht regio’s al.</w:t>
       </w:r>
     </w:p>
     <w:p>
@@ -3992,7 +4229,7 @@
         <w:t xml:space="preserve">6. </w:t>
       </w:r>
       <w:r>
-        <w:t>Wat er gebeurt als een deelnemer maar één paar schoeisel heeft. eCRF 24 voorziet een deel A1 en een deel A2; het formulier zegt niet of het tweede deel dan leeg blijft of vervalt.</w:t>
+        <w:t>Of de klinieken rechtstreeks vanuit de novel database meten dan wel in novel studio, en of er één centrale database komt of één per centrum. Sint_Jan_Paradise_Project bestaat en draait lokaal; de vraag is hoe de vijf andere centra erin terechtkomen, en hoe de back-up loopt.</w:t>
       </w:r>
     </w:p>
     <w:p>
@@ -4004,20 +4241,6 @@
           <w:b/>
         </w:rPr>
         <w:t xml:space="preserve">7. </w:t>
-      </w:r>
-      <w:r>
-        <w:t>Of de klinieken rechtstreeks vanuit de novel database meten dan wel in novel studio, en of er één centrale database komt of één per centrum. Sint_Jan_Paradise_Project bestaat en draait lokaal; de vraag is hoe de vijf andere centra erin terechtkomen, en hoe de back-up loopt.</w:t>
-      </w:r>
-    </w:p>
-    <w:p>
-      <w:pPr>
-        <w:ind w:left="397" w:hanging="397"/>
-      </w:pPr>
-      <w:r>
-        <w:rPr>
-          <w:b/>
-        </w:rPr>
-        <w:t xml:space="preserve">8. </w:t>
       </w:r>
       <w:r>
         <w:t>Wat te doen als het ook na herhalen niet lukt: een deelnemer die de tien meter niet aan één stuk haalt, of die na drie doorgangen nog geen 12 bruikbare stappen per voet levert. Meten met minder, of noteren als niet meetbaar?</w:t>

</xml_diff>

<commit_message>
Drukmeting: referentie visite 2 in beide tools, snelheid niet meer gemeten
Pressure Monitoring Tool: blok 4, 5 en 7 rekenen nu tegenover de meting
zonder zool op visite 2 (nieuwe kolom D), met melding als die ontbreekt;
blad Visit en sjabloon: opvolging tegenover zonder zool visite 2, hiel telt
mee, oranje bij een stijging van 5% of meer. eCRF 24b: "blootsvoets" wordt
"zonder zool op visite 2", keuzelijst voor de vorige voetzweer die mee
DOELREGIO wordt, oranje bij 5% stijging, MPP-beeld in plaats van drukplaat.
eCRF 09b versie 1.2: loopsnelheid niet gemeten, uitleg referentiekolom,
databases per centrum en centraal samenvoegen. PARADISE_BRONNEN bijgewerkt.

Co-Authored-By: Claude Opus 5.5 <noreply@anthropic.com>
</commit_message>
<xml_diff>
--- a/(e)CRF/Per nummer/09b_Werkinstructie drukmeting (SOP Novel pedar).docx
+++ b/(e)CRF/Per nummer/09b_Werkinstructie drukmeting (SOP Novel pedar).docx
@@ -103,7 +103,7 @@
                 <w:sz w:val="20"/>
                 <w:lang w:val="nl-BE"/>
               </w:rPr>
-              <w:t>1.1</w:t>
+              <w:t>1.2</w:t>
             </w:r>
           </w:p>
         </w:tc>
@@ -139,7 +139,7 @@
                 <w:sz w:val="20"/>
                 <w:lang w:val="nl-BE"/>
               </w:rPr>
-              <w:t>25/09/2026 — vervangt versie 1.0 van 14/09/2026</w:t>
+              <w:t>25/09/2026 — vervangt versie 1.1 van dezelfde dag (loopsnelheid niet meer gemeten, referentiekolom in de Pressure Monitoring Tool, samenvoegen van de databases)</w:t>
             </w:r>
           </w:p>
         </w:tc>
@@ -821,7 +821,7 @@
         <w:rPr>
           <w:lang w:val="nl-BE"/>
         </w:rPr>
-        <w:t>Kies een vlakke, rechte looproute zonder obstakels. Tien tot twaalf meter is ideaal — Bus et al. gebruikten 12 meter [6] — maar het is geen eis. Wat telt, is dat je per voet minstens 12 bruikbare mid-gait stappen haalt [5]. Op een korter pad lukt dat met meer doorgangen (stap 37).</w:t>
+        <w:t>Kies een vlakke, rechte looproute zonder obstakels. Tien tot twaalf meter is ideaal — Bus et al. gebruikten 12 meter [6] — maar het is geen eis. Wat telt, is dat je per voet minstens 12 bruikbare mid-gait stappen haalt [5]. Op een korter pad lukt dat met meer doorgangen (stap 36).</w:t>
       </w:r>
     </w:p>
     <w:p>
@@ -839,7 +839,7 @@
         <w:rPr>
           <w:lang w:val="nl-BE"/>
         </w:rPr>
-        <w:t>Leg drie markeringen met tape: het vertrekpunt, tape 1 waar de meetzone begint en tape 2 waar ze eindigt (figuur 2). Laat vóór tape 1 ruimte om op snelheid te komen en na tape 2 ruimte om af te remmen en te keren. Meet de afstand tussen tape 1 en tape 2 één keer op en noteer ze: die heb je nodig voor de loopsnelheid (stap 36).</w:t>
+        <w:t>Leg drie markeringen met tape: het vertrekpunt, tape 1 waar de meetzone begint en tape 2 waar ze eindigt (figuur 2). Laat vóór tape 1 ruimte om op snelheid te komen en na tape 2 ruimte om af te remmen en te keren.</w:t>
       </w:r>
     </w:p>
     <w:p>
@@ -987,7 +987,7 @@
         <w:rPr>
           <w:lang w:val="nl-BE"/>
         </w:rPr>
-        <w:t>Zolang de zool niet in regio’s verdeeld kan worden, doet het palet dat werk: het toont met kleur waar de druk boven de norm uitkomt. Zonder deze instelling kun je stap 45 niet uitvoeren.</w:t>
+        <w:t>Zolang de zool niet in regio’s verdeeld kan worden, doet het palet dat werk: het toont met kleur waar de druk boven de norm uitkomt. Zonder deze instelling kun je stap 44 niet uitvoeren.</w:t>
       </w:r>
     </w:p>
     <w:p>
@@ -1912,7 +1912,7 @@
           <w:i/>
           <w:lang w:val="nl-BE"/>
         </w:rPr>
-        <w:t>De namen volgen die van Brugge. Of de centra elk een eigen database houden of in één centrale database samenkomen, legt het studieteam vast vóór de eerste installatie buiten Brugge; deze tabel wordt dan bijgewerkt.</w:t>
+        <w:t>Elk centrum meet in een eigen database op de eigen laptop; de namen volgen die van Brugge. Eén gedeelde database waarin alle centra rechtstreeks meten, kan alleen als elke laptop via het netwerk dezelfde SQL-server bereikt [1, §1.1 en bijlage K]; zo’n verbinding tussen zes ziekenhuizen is niet voorzien. Het studieteam voegt de databases achteraf samen (hoofdstuk 15).</w:t>
       </w:r>
     </w:p>
     <w:p>
@@ -4087,7 +4087,7 @@
         <w:rPr>
           <w:lang w:val="nl-BE"/>
         </w:rPr>
-        <w:t>Op visite 1 is er nog geen CMFO: alleen de basismeting, drie keer na elkaar, als informatie voor de pedorthist [9]. Links en rechts worden tegelijk opgenomen en per voet apart uitgelezen. Sla stap 40 over: er is niets om aan te toetsen.</w:t>
+        <w:t>Op visite 1 is er nog geen CMFO: alleen de basismeting, drie keer na elkaar, als informatie voor de pedorthist [9]. Links en rechts worden tegelijk opgenomen en per voet apart uitgelezen. Sla stap 39 over: er is niets om aan te toetsen.</w:t>
       </w:r>
     </w:p>
     <w:p>
@@ -4236,7 +4236,15 @@
         <w:rPr>
           <w:lang w:val="nl-BE"/>
         </w:rPr>
-        <w:t xml:space="preserve"> en geef dan het teken om te vertrekken, op zelfgekozen comfortsnelheid.</w:t>
+        <w:t xml:space="preserve"> en geef dan het teken om te vertrekken. Vraag de deelnemer te wandelen zoals gewoonlijk, op de eigen comfortabele snelheid, en gebruik bij elke doorgang, elke conditie en elke visite dezelfde woorden.</w:t>
+      </w:r>
+    </w:p>
+    <w:p>
+      <w:r>
+        <w:rPr>
+          <w:lang w:val="nl-BE"/>
+        </w:rPr>
+        <w:t>De loopsnelheid wordt niet gemeten [9]. Bus et al. hielden ze binnen 5% constant [6]; in PARADISE is een gelijke instructie de enige waarborg. Stapt de deelnemer duidelijk sneller of trager dan bij de vorige doorgang, doe die doorgang dan over.</w:t>
       </w:r>
     </w:p>
     <w:p>
@@ -4254,16 +4262,7 @@
         <w:rPr>
           <w:lang w:val="nl-BE"/>
         </w:rPr>
-        <w:t>Meet bij elke doorgang met een chronometer de tijd tussen tape 1 en tape 2. De loopsnelheid is de afstand tussen de tapes gedeeld door die tijd, in m/s [6]. Op visite 1 is dat de comfortsnelheid van de deelnemer; bij elke volgende meting blijft de snelheid binnen 5% daarvan. Noteer ze bij Loopsnelheid op eCRF 09 of 24.</w:t>
-      </w:r>
-    </w:p>
-    <w:p>
-      <w:r>
-        <w:rPr>
-          <w:i/>
-          <w:lang w:val="nl-BE"/>
-        </w:rPr>
-        <w:t>Voorbeeld: 6 m in 5,0 s is 1,20 m/s. 5% daarvan is 0,06 m/s, dus bij opvolging ligt de snelheid tussen 1,14 en 1,26 m/s. Ligt ze erbuiten, doe de doorgang dan over.</w:t>
+        <w:t>Verzamel per voet minstens 12 bruikbare mid-gait stappen [5]. Mid-gait zijn de stappen op constante snelheid, in de meetzone tussen tape 1 en tape 2 (figuur 2). De stappen van de aanloop (versnellen) en van de uitloop (vertragen en keren) tellen niet mee: minstens de eerste en de laatste stap van elke doorgang vallen weg [7].</w:t>
       </w:r>
     </w:p>
     <w:p>
@@ -4281,7 +4280,7 @@
         <w:rPr>
           <w:lang w:val="nl-BE"/>
         </w:rPr>
-        <w:t>Verzamel per voet minstens 12 bruikbare mid-gait stappen [5]. Mid-gait zijn de stappen op constante snelheid, in de meetzone tussen tape 1 en tape 2 (figuur 2). De stappen van de aanloop (versnellen) en van de uitloop (vertragen en keren) tellen niet mee: minstens de eerste en de laatste stap van elke doorgang vallen weg [7].</w:t>
+        <w:t>Tel per doorgang de mid-gait stappen en herhaal tot je er per voet 12 hebt. Reken op drie à vier doorgangen — Bus et al. verzamelden 15 mid-gait stappen in vier doorgangen op een pad van 12 meter [6] — en op een korter pad op meer.</w:t>
       </w:r>
     </w:p>
     <w:p>
@@ -4299,7 +4298,20 @@
         <w:rPr>
           <w:lang w:val="nl-BE"/>
         </w:rPr>
-        <w:t>Tel per doorgang de mid-gait stappen en herhaal tot je er per voet 12 hebt. Reken op drie à vier doorgangen — Bus et al. verzamelden 15 mid-gait stappen in vier doorgangen op een pad van 12 meter [6] — en op een korter pad op meer.</w:t>
+        <w:t xml:space="preserve">Klik na de laatste doorgang op </w:t>
+      </w:r>
+      <w:r>
+        <w:rPr>
+          <w:b/>
+          <w:lang w:val="nl-BE"/>
+        </w:rPr>
+        <w:t>Stop</w:t>
+      </w:r>
+      <w:r>
+        <w:rPr>
+          <w:lang w:val="nl-BE"/>
+        </w:rPr>
+        <w:t>.</w:t>
       </w:r>
     </w:p>
     <w:p>
@@ -4317,38 +4329,7 @@
         <w:rPr>
           <w:lang w:val="nl-BE"/>
         </w:rPr>
-        <w:t xml:space="preserve">Klik na de laatste doorgang op </w:t>
-      </w:r>
-      <w:r>
-        <w:rPr>
-          <w:b/>
-          <w:lang w:val="nl-BE"/>
-        </w:rPr>
-        <w:t>Stop</w:t>
-      </w:r>
-      <w:r>
-        <w:rPr>
-          <w:lang w:val="nl-BE"/>
-        </w:rPr>
-        <w:t>.</w:t>
-      </w:r>
-    </w:p>
-    <w:p>
-      <w:pPr>
-        <w:ind w:left="397" w:hanging="397"/>
-      </w:pPr>
-      <w:r>
-        <w:rPr>
-          <w:b/>
-          <w:lang w:val="nl-BE"/>
-        </w:rPr>
-        <w:t xml:space="preserve">40. </w:t>
-      </w:r>
-      <w:r>
-        <w:rPr>
-          <w:lang w:val="nl-BE"/>
-        </w:rPr>
-        <w:t>Voor de therapeutische meting (B): schoenen uit, CMFO in de schoen, pedar-zool daar bovenop, en herhaal stap 30 tot 39. Niet opnieuw nulstellen. Houd de snelheid binnen 5% van die op visite 1.</w:t>
+        <w:t>Voor de therapeutische meting (B): schoenen uit, CMFO in de schoen, pedar-zool daar bovenop, en herhaal stap 30 tot 38. Niet opnieuw nulstellen. Geef dezelfde instructie als bij A.</w:t>
       </w:r>
     </w:p>
     <w:p>
@@ -4375,7 +4356,7 @@
           <w:b/>
           <w:lang w:val="nl-BE"/>
         </w:rPr>
-        <w:t xml:space="preserve">41. </w:t>
+        <w:t xml:space="preserve">40. </w:t>
       </w:r>
       <w:r>
         <w:rPr>
@@ -4467,7 +4448,7 @@
           <w:b/>
           <w:lang w:val="nl-BE"/>
         </w:rPr>
-        <w:t xml:space="preserve">42. </w:t>
+        <w:t xml:space="preserve">41. </w:t>
       </w:r>
       <w:r>
         <w:rPr>
@@ -4679,38 +4660,38 @@
           <w:b/>
           <w:lang w:val="nl-BE"/>
         </w:rPr>
+        <w:t xml:space="preserve">42. </w:t>
+      </w:r>
+      <w:r>
+        <w:rPr>
+          <w:lang w:val="nl-BE"/>
+        </w:rPr>
+        <w:t xml:space="preserve">Klik links op </w:t>
+      </w:r>
+      <w:r>
+        <w:rPr>
+          <w:b/>
+          <w:lang w:val="nl-BE"/>
+        </w:rPr>
+        <w:t>MPP</w:t>
+      </w:r>
+      <w:r>
+        <w:rPr>
+          <w:lang w:val="nl-BE"/>
+        </w:rPr>
+        <w:t>. Deze weergave toont per sensor de hoogste druk tijdens de meting. Daarop wordt de norm getoetst — niet op de MVP-weergave, die gemiddelden toont en dus lagere waarden geeft.</w:t>
+      </w:r>
+    </w:p>
+    <w:p>
+      <w:pPr>
+        <w:ind w:left="397" w:hanging="397"/>
+      </w:pPr>
+      <w:r>
+        <w:rPr>
+          <w:b/>
+          <w:lang w:val="nl-BE"/>
+        </w:rPr>
         <w:t xml:space="preserve">43. </w:t>
-      </w:r>
-      <w:r>
-        <w:rPr>
-          <w:lang w:val="nl-BE"/>
-        </w:rPr>
-        <w:t xml:space="preserve">Klik links op </w:t>
-      </w:r>
-      <w:r>
-        <w:rPr>
-          <w:b/>
-          <w:lang w:val="nl-BE"/>
-        </w:rPr>
-        <w:t>MPP</w:t>
-      </w:r>
-      <w:r>
-        <w:rPr>
-          <w:lang w:val="nl-BE"/>
-        </w:rPr>
-        <w:t>. Deze weergave toont per sensor de hoogste druk tijdens de meting. Daarop wordt de norm getoetst — niet op de MVP-weergave, die gemiddelden toont en dus lagere waarden geeft.</w:t>
-      </w:r>
-    </w:p>
-    <w:p>
-      <w:pPr>
-        <w:ind w:left="397" w:hanging="397"/>
-      </w:pPr>
-      <w:r>
-        <w:rPr>
-          <w:b/>
-          <w:lang w:val="nl-BE"/>
-        </w:rPr>
-        <w:t xml:space="preserve">44. </w:t>
       </w:r>
       <w:r>
         <w:rPr>
@@ -4729,7 +4710,7 @@
           <w:b/>
           <w:lang w:val="nl-BE"/>
         </w:rPr>
-        <w:t xml:space="preserve">45. </w:t>
+        <w:t xml:space="preserve">44. </w:t>
       </w:r>
       <w:r>
         <w:rPr>
@@ -4795,7 +4776,7 @@
           <w:b/>
           <w:lang w:val="nl-BE"/>
         </w:rPr>
-        <w:t xml:space="preserve">46. </w:t>
+        <w:t xml:space="preserve">45. </w:t>
       </w:r>
       <w:r>
         <w:rPr>
@@ -5289,7 +5270,7 @@
         <w:rPr>
           <w:lang w:val="nl-BE"/>
         </w:rPr>
-        <w:t>MPP neemt per sensor de hoogste waarde over de hele opname: ook over de aanloop, de uitloop, het keren en een eventuele misstap. Aan de stoel kun je die er niet uit halen (stap 42).</w:t>
+        <w:t>MPP neemt per sensor de hoogste waarde over de hele opname: ook over de aanloop, de uitloop, het keren en een eventuele misstap. Aan de stoel kun je die er niet uit halen (stap 41).</w:t>
       </w:r>
     </w:p>
     <w:p>
@@ -5571,7 +5552,7 @@
                 <w:sz w:val="20"/>
                 <w:lang w:val="nl-BE"/>
               </w:rPr>
-              <w:t>De drie regio’s per voet — de vorige voetzweer eerst — met hun piekdruk zonder en met de CMFO</w:t>
+              <w:t>De drie regio’s per voet — de vorige voetzweer eerst — met de referentie van visite 2 en de piekdruk zonder en met zool; % lager dan referentie en Norm gehaald? rekenen zelf</w:t>
             </w:r>
           </w:p>
         </w:tc>
@@ -5607,7 +5588,7 @@
                 <w:sz w:val="20"/>
                 <w:lang w:val="nl-BE"/>
               </w:rPr>
-              <w:t>De drie doelregio’s, en of de druk sinds de vorige keer met 5% of meer gestegen is</w:t>
+              <w:t>De drie doelregio’s, met dezelfde kolommen, en of de druk sinds de vorige keer met 5% of meer gestegen is</w:t>
             </w:r>
           </w:p>
         </w:tc>
@@ -5683,7 +5664,7 @@
     <w:p>
       <w:pPr>
         <w:pBdr>
-          <w:left w:val="single" w:sz="18" w:space="8" w:color="B3261E"/>
+          <w:left w:val="single" w:sz="18" w:space="8" w:color="123A5F"/>
         </w:pBdr>
         <w:spacing w:before="120" w:after="120"/>
         <w:ind w:left="425"/>
@@ -5691,18 +5672,18 @@
       <w:r>
         <w:rPr>
           <w:b/>
-          <w:color w:val="B3261E"/>
+          <w:color w:val="123A5F"/>
           <w:sz w:val="20"/>
           <w:lang w:val="nl-BE"/>
         </w:rPr>
-        <w:t xml:space="preserve">▲ LET OP  </w:t>
+        <w:t xml:space="preserve">■ CONTROLEER  </w:t>
       </w:r>
       <w:r>
         <w:rPr>
           <w:b/>
           <w:lang w:val="nl-BE"/>
         </w:rPr>
-        <w:t>De kolommen % verschil en Norm gehaald? in blok 4 en 5 rekenen tegenover conditie A van dezelfde sessie. Op visite 2 is dat de referentie; op maand 6, 12 en 18 niet. Reken de 25% daar zelf na tegenover visite 2, met de formule uit hoofdstuk 12, tot de tool is aangepast.</w:t>
+        <w:t>Vul in blok 4, 5 en 7 kolom D in: de referentie, de piekdruk zonder zool op visite 2. Op visite 2 is dat dezelfde waarde als in kolom E; op maand 6, 12 en 18 neem je ze over van visite 2. Ontbreekt de referentie, dan toetst de tool alleen de grens van 200 kPa en meldt ze referentie ontbreekt.</w:t>
       </w:r>
     </w:p>
     <w:p>
@@ -5714,26 +5695,62 @@
           <w:b/>
           <w:lang w:val="nl-BE"/>
         </w:rPr>
+        <w:t xml:space="preserve">46. </w:t>
+      </w:r>
+      <w:r>
+        <w:rPr>
+          <w:lang w:val="nl-BE"/>
+        </w:rPr>
+        <w:t xml:space="preserve">Gebruik </w:t>
+      </w:r>
+      <w:r>
+        <w:rPr>
+          <w:b/>
+          <w:lang w:val="nl-BE"/>
+        </w:rPr>
+        <w:t>Export as</w:t>
+      </w:r>
+      <w:r>
+        <w:rPr>
+          <w:lang w:val="nl-BE"/>
+        </w:rPr>
+        <w:t xml:space="preserve"> om de meting te exporteren.</w:t>
+      </w:r>
+    </w:p>
+    <w:p>
+      <w:pPr>
+        <w:ind w:left="397" w:hanging="397"/>
+      </w:pPr>
+      <w:r>
+        <w:rPr>
+          <w:b/>
+          <w:lang w:val="nl-BE"/>
+        </w:rPr>
         <w:t xml:space="preserve">47. </w:t>
       </w:r>
       <w:r>
         <w:rPr>
           <w:lang w:val="nl-BE"/>
         </w:rPr>
-        <w:t xml:space="preserve">Gebruik </w:t>
-      </w:r>
+        <w:t>Noteer de bestandsnaam en de datum op eCRF 09 of 24, samen met de zoolcodes die je gebruikt hebt.</w:t>
+      </w:r>
+    </w:p>
+    <w:p>
+      <w:pPr>
+        <w:ind w:left="397" w:hanging="397"/>
+      </w:pPr>
       <w:r>
         <w:rPr>
           <w:b/>
           <w:lang w:val="nl-BE"/>
         </w:rPr>
-        <w:t>Export as</w:t>
-      </w:r>
-      <w:r>
-        <w:rPr>
-          <w:lang w:val="nl-BE"/>
-        </w:rPr>
-        <w:t xml:space="preserve"> om de meting te exporteren.</w:t>
+        <w:t xml:space="preserve">48. </w:t>
+      </w:r>
+      <w:r>
+        <w:rPr>
+          <w:lang w:val="nl-BE"/>
+        </w:rPr>
+        <w:t>Controleer dat de schermafbeelding in de Pressure Monitoring Tool staat, bij de juiste deelnemer, het juiste meetmoment en de juiste conditie — zonder of met de CMFO.</w:t>
       </w:r>
     </w:p>
     <w:p>
@@ -5745,13 +5762,13 @@
           <w:b/>
           <w:lang w:val="nl-BE"/>
         </w:rPr>
-        <w:t xml:space="preserve">48. </w:t>
-      </w:r>
-      <w:r>
-        <w:rPr>
-          <w:lang w:val="nl-BE"/>
-        </w:rPr>
-        <w:t>Noteer de bestandsnaam en de datum op eCRF 09 of 24, samen met de zoolcodes die je gebruikt hebt.</w:t>
+        <w:t xml:space="preserve">49. </w:t>
+      </w:r>
+      <w:r>
+        <w:rPr>
+          <w:lang w:val="nl-BE"/>
+        </w:rPr>
+        <w:t>Sla de Pressure Monitoring Tool op en mail ze naar janou.debuyser@kuleuven.be.</w:t>
       </w:r>
     </w:p>
     <w:p>
@@ -5763,43 +5780,7 @@
           <w:b/>
           <w:lang w:val="nl-BE"/>
         </w:rPr>
-        <w:t xml:space="preserve">49. </w:t>
-      </w:r>
-      <w:r>
-        <w:rPr>
-          <w:lang w:val="nl-BE"/>
-        </w:rPr>
-        <w:t>Controleer dat de schermafbeelding in de Pressure Monitoring Tool staat, bij de juiste deelnemer, het juiste meetmoment en de juiste conditie — zonder of met de CMFO.</w:t>
-      </w:r>
-    </w:p>
-    <w:p>
-      <w:pPr>
-        <w:ind w:left="397" w:hanging="397"/>
-      </w:pPr>
-      <w:r>
-        <w:rPr>
-          <w:b/>
-          <w:lang w:val="nl-BE"/>
-        </w:rPr>
         <w:t xml:space="preserve">50. </w:t>
-      </w:r>
-      <w:r>
-        <w:rPr>
-          <w:lang w:val="nl-BE"/>
-        </w:rPr>
-        <w:t>Sla de Pressure Monitoring Tool op en mail ze naar janou.debuyser@kuleuven.be.</w:t>
-      </w:r>
-    </w:p>
-    <w:p>
-      <w:pPr>
-        <w:ind w:left="397" w:hanging="397"/>
-      </w:pPr>
-      <w:r>
-        <w:rPr>
-          <w:b/>
-          <w:lang w:val="nl-BE"/>
-        </w:rPr>
-        <w:t xml:space="preserve">51. </w:t>
       </w:r>
       <w:r>
         <w:rPr>
@@ -6106,6 +6087,48 @@
         <w:rPr>
           <w:lang w:val="nl-BE"/>
         </w:rPr>
+        <w:t xml:space="preserve">Het studieteam brengt de databases van de centra samen in één studiedatabase. Het haalt de database van het centrum op met </w:t>
+      </w:r>
+      <w:r>
+        <w:rPr>
+          <w:b/>
+          <w:lang w:val="nl-BE"/>
+        </w:rPr>
+        <w:t>Export DB</w:t>
+      </w:r>
+      <w:r>
+        <w:rPr>
+          <w:lang w:val="nl-BE"/>
+        </w:rPr>
+        <w:t xml:space="preserve"> (formaat novel database, met Load file bodies into DB, zodat de meetbestanden mee in de database zitten) en leest ze centraal in met </w:t>
+      </w:r>
+      <w:r>
+        <w:rPr>
+          <w:b/>
+          <w:lang w:val="nl-BE"/>
+        </w:rPr>
+        <w:t>Import DB</w:t>
+      </w:r>
+      <w:r>
+        <w:rPr>
+          <w:lang w:val="nl-BE"/>
+        </w:rPr>
+        <w:t>, met Check for duplicate records [1, §3.1.4 en §3.1.5]. Een database kan ook als bestand verhuizen: loskoppelen op de laptop van het centrum, het .mdf-bestand kopiëren en centraal registreren [1, bijlage J].</w:t>
+      </w:r>
+    </w:p>
+    <w:p>
+      <w:r>
+        <w:rPr>
+          <w:lang w:val="nl-BE"/>
+        </w:rPr>
+        <w:t>Dat samenvoegen werkt alleen omdat de deelnemerscode uniek is over alle centra: REDCap kent ze toe. Naam en geboortedatum zijn voor iedereen gelijk (X, X, 01/01/1900), dus de code is het enige dat deelnemers onderscheidt.</w:t>
+      </w:r>
+    </w:p>
+    <w:p>
+      <w:r>
+        <w:rPr>
+          <w:lang w:val="nl-BE"/>
+        </w:rPr>
         <w:t>Exporteert het studieteam de database, dan blijft Include confidential information uitgevinkt: zo gaan naam, adres en telefoonnummer nooit mee [1, bijlage A].</w:t>
       </w:r>
     </w:p>
@@ -6141,26 +6164,70 @@
           <w:b/>
           <w:lang w:val="nl-BE"/>
         </w:rPr>
+        <w:t xml:space="preserve">51. </w:t>
+      </w:r>
+      <w:r>
+        <w:rPr>
+          <w:lang w:val="nl-BE"/>
+        </w:rPr>
+        <w:t xml:space="preserve">Controleer dat de meting gestopt is: de timer staat stil en de knop </w:t>
+      </w:r>
+      <w:r>
+        <w:rPr>
+          <w:b/>
+          <w:lang w:val="nl-BE"/>
+        </w:rPr>
+        <w:t>Stop</w:t>
+      </w:r>
+      <w:r>
+        <w:rPr>
+          <w:lang w:val="nl-BE"/>
+        </w:rPr>
+        <w:t xml:space="preserve"> is niet meer actief.</w:t>
+      </w:r>
+    </w:p>
+    <w:p>
+      <w:pPr>
+        <w:ind w:left="397" w:hanging="397"/>
+      </w:pPr>
+      <w:r>
+        <w:rPr>
+          <w:b/>
+          <w:lang w:val="nl-BE"/>
+        </w:rPr>
         <w:t xml:space="preserve">52. </w:t>
       </w:r>
       <w:r>
         <w:rPr>
           <w:lang w:val="nl-BE"/>
         </w:rPr>
-        <w:t xml:space="preserve">Controleer dat de meting gestopt is: de timer staat stil en de knop </w:t>
+        <w:t xml:space="preserve">Ga in novel studio naar </w:t>
       </w:r>
       <w:r>
         <w:rPr>
           <w:b/>
           <w:lang w:val="nl-BE"/>
         </w:rPr>
-        <w:t>Stop</w:t>
-      </w:r>
-      <w:r>
-        <w:rPr>
-          <w:lang w:val="nl-BE"/>
-        </w:rPr>
-        <w:t xml:space="preserve"> is niet meer actief.</w:t>
+        <w:t>Manage Devices</w:t>
+      </w:r>
+      <w:r>
+        <w:rPr>
+          <w:lang w:val="nl-BE"/>
+        </w:rPr>
+        <w:t xml:space="preserve"> en klik bij beide toestellen op </w:t>
+      </w:r>
+      <w:r>
+        <w:rPr>
+          <w:b/>
+          <w:lang w:val="nl-BE"/>
+        </w:rPr>
+        <w:t>Disconnect</w:t>
+      </w:r>
+      <w:r>
+        <w:rPr>
+          <w:lang w:val="nl-BE"/>
+        </w:rPr>
+        <w:t>.</w:t>
       </w:r>
     </w:p>
     <w:p>
@@ -6178,27 +6245,45 @@
         <w:rPr>
           <w:lang w:val="nl-BE"/>
         </w:rPr>
-        <w:t xml:space="preserve">Ga in novel studio naar </w:t>
-      </w:r>
+        <w:t>Sluit novel studio. Het bestand is al bewaard onder het bezoek waaruit je de meting startte.</w:t>
+      </w:r>
+    </w:p>
+    <w:p>
+      <w:pPr>
+        <w:ind w:left="397" w:hanging="397"/>
+      </w:pPr>
       <w:r>
         <w:rPr>
           <w:b/>
           <w:lang w:val="nl-BE"/>
         </w:rPr>
-        <w:t>Manage Devices</w:t>
-      </w:r>
-      <w:r>
-        <w:rPr>
-          <w:lang w:val="nl-BE"/>
-        </w:rPr>
-        <w:t xml:space="preserve"> en klik bij beide toestellen op </w:t>
+        <w:t xml:space="preserve">54. </w:t>
+      </w:r>
+      <w:r>
+        <w:rPr>
+          <w:lang w:val="nl-BE"/>
+        </w:rPr>
+        <w:t xml:space="preserve">Controleer in de database, in het tabblad </w:t>
       </w:r>
       <w:r>
         <w:rPr>
           <w:b/>
           <w:lang w:val="nl-BE"/>
         </w:rPr>
-        <w:t>Disconnect</w:t>
+        <w:t>pedar Files</w:t>
+      </w:r>
+      <w:r>
+        <w:rPr>
+          <w:lang w:val="nl-BE"/>
+        </w:rPr>
+        <w:t xml:space="preserve">, dat de meting eronder staat. Sluit dan het bezoek met </w:t>
+      </w:r>
+      <w:r>
+        <w:rPr>
+          <w:b/>
+          <w:lang w:val="nl-BE"/>
+        </w:rPr>
+        <w:t>Close</w:t>
       </w:r>
       <w:r>
         <w:rPr>
@@ -6216,13 +6301,13 @@
           <w:b/>
           <w:lang w:val="nl-BE"/>
         </w:rPr>
-        <w:t xml:space="preserve">54. </w:t>
-      </w:r>
-      <w:r>
-        <w:rPr>
-          <w:lang w:val="nl-BE"/>
-        </w:rPr>
-        <w:t>Sluit novel studio. Het bestand is al bewaard onder het bezoek waaruit je de meting startte.</w:t>
+        <w:t xml:space="preserve">55. </w:t>
+      </w:r>
+      <w:r>
+        <w:rPr>
+          <w:lang w:val="nl-BE"/>
+        </w:rPr>
+        <w:t>Zet beide zenders uit: houd de joystick op de voorkant 3 seconden naar beneden, tot de lampjes doven.</w:t>
       </w:r>
     </w:p>
     <w:p>
@@ -6234,105 +6319,43 @@
           <w:b/>
           <w:lang w:val="nl-BE"/>
         </w:rPr>
-        <w:t xml:space="preserve">55. </w:t>
-      </w:r>
-      <w:r>
-        <w:rPr>
-          <w:lang w:val="nl-BE"/>
-        </w:rPr>
-        <w:t xml:space="preserve">Controleer in de database, in het tabblad </w:t>
-      </w:r>
+        <w:t xml:space="preserve">56. </w:t>
+      </w:r>
+      <w:r>
+        <w:rPr>
+          <w:lang w:val="nl-BE"/>
+        </w:rPr>
+        <w:t>Koppel de zolen los, veeg ze schoon en berg ze vlak op. Nooit vouwen of oprollen [3].</w:t>
+      </w:r>
+    </w:p>
+    <w:p>
+      <w:pPr>
+        <w:ind w:left="397" w:hanging="397"/>
+      </w:pPr>
       <w:r>
         <w:rPr>
           <w:b/>
           <w:lang w:val="nl-BE"/>
         </w:rPr>
-        <w:t>pedar Files</w:t>
-      </w:r>
-      <w:r>
-        <w:rPr>
-          <w:lang w:val="nl-BE"/>
-        </w:rPr>
-        <w:t xml:space="preserve">, dat de meting eronder staat. Sluit dan het bezoek met </w:t>
-      </w:r>
+        <w:t xml:space="preserve">57. </w:t>
+      </w:r>
+      <w:r>
+        <w:rPr>
+          <w:lang w:val="nl-BE"/>
+        </w:rPr>
+        <w:t>Zet de router uit.</w:t>
+      </w:r>
+    </w:p>
+    <w:p>
+      <w:pPr>
+        <w:ind w:left="397" w:hanging="397"/>
+      </w:pPr>
       <w:r>
         <w:rPr>
           <w:b/>
           <w:lang w:val="nl-BE"/>
         </w:rPr>
-        <w:t>Close</w:t>
-      </w:r>
-      <w:r>
-        <w:rPr>
-          <w:lang w:val="nl-BE"/>
-        </w:rPr>
-        <w:t>.</w:t>
-      </w:r>
-    </w:p>
-    <w:p>
-      <w:pPr>
-        <w:ind w:left="397" w:hanging="397"/>
-      </w:pPr>
-      <w:r>
-        <w:rPr>
-          <w:b/>
-          <w:lang w:val="nl-BE"/>
-        </w:rPr>
-        <w:t xml:space="preserve">56. </w:t>
-      </w:r>
-      <w:r>
-        <w:rPr>
-          <w:lang w:val="nl-BE"/>
-        </w:rPr>
-        <w:t>Zet beide zenders uit: houd de joystick op de voorkant 3 seconden naar beneden, tot de lampjes doven.</w:t>
-      </w:r>
-    </w:p>
-    <w:p>
-      <w:pPr>
-        <w:ind w:left="397" w:hanging="397"/>
-      </w:pPr>
-      <w:r>
-        <w:rPr>
-          <w:b/>
-          <w:lang w:val="nl-BE"/>
-        </w:rPr>
-        <w:t xml:space="preserve">57. </w:t>
-      </w:r>
-      <w:r>
-        <w:rPr>
-          <w:lang w:val="nl-BE"/>
-        </w:rPr>
-        <w:t>Koppel de zolen los, veeg ze schoon en berg ze vlak op. Nooit vouwen of oprollen [3].</w:t>
-      </w:r>
-    </w:p>
-    <w:p>
-      <w:pPr>
-        <w:ind w:left="397" w:hanging="397"/>
-      </w:pPr>
-      <w:r>
-        <w:rPr>
-          <w:b/>
-          <w:lang w:val="nl-BE"/>
-        </w:rPr>
         <w:t xml:space="preserve">58. </w:t>
-      </w:r>
-      <w:r>
-        <w:rPr>
-          <w:lang w:val="nl-BE"/>
-        </w:rPr>
-        <w:t>Zet de router uit.</w:t>
-      </w:r>
-    </w:p>
-    <w:p>
-      <w:pPr>
-        <w:ind w:left="397" w:hanging="397"/>
-      </w:pPr>
-      <w:r>
-        <w:rPr>
-          <w:b/>
-          <w:lang w:val="nl-BE"/>
-        </w:rPr>
-        <w:t xml:space="preserve">59. </w:t>
       </w:r>
       <w:r>
         <w:rPr>
@@ -7221,7 +7244,7 @@
           <w:sz w:val="18"/>
           <w:lang w:val="nl-BE"/>
         </w:rPr>
-        <w:t>PARADISE-studieteam. Beslissingen over de drukmeting van 11, 14 en 22 september 2026 (PARADISE_BRONNEN).</w:t>
+        <w:t>PARADISE-studieteam. Beslissingen over de drukmeting van 11, 14, 22 en 25 september 2026 (PARADISE_BRONNEN).</w:t>
       </w:r>
     </w:p>
     <w:p>
@@ -7562,7 +7585,7 @@
         <w:sz w:val="16"/>
         <w:lang w:val="nl-BE"/>
       </w:rPr>
-      <w:t xml:space="preserve">PARADISE-studie  ·  eCRF 09b: Werkinstructie drukmeting (SOP Novel pedar) ·  Versie 1.1  ·  25/09/2026  ·  Pagina </w:t>
+      <w:t xml:space="preserve">PARADISE-studie  ·  eCRF 09b: Werkinstructie drukmeting (SOP Novel pedar) ·  Versie 1.2  ·  25/09/2026  ·  Pagina </w:t>
     </w:r>
     <w:r>
       <w:rPr>

</xml_diff>

<commit_message>
Drie doelregio's per voet; geen maskerexport in de ziekenhuizen
REDCap: e09, e24uc en e24oc met doelregio d1-d3 links en d4-d6 rechts,
zonder zijdeveld; berekende velden en norm_totaal (van zes) mee;
1449 velden, documenten bijgewerkt. eCRF 09 en 24 (alle kopieen): per
voet, met de hielregel. Pressure Monitoring Tool: blok 7 geschrapt,
blokken op Visit en sjabloon "in te vullen door het studieteam", geen
maskerexport meer vermeld; 24b zonder "Multimask". 09b versie 1.4 zonder
blok 7 en zonder de tabel met maskerprogramma's. PARADISE_BRONNEN en
werkpakket1-tijdlijn bijgewerkt.

Co-Authored-By: Claude Opus 5.5 <noreply@anthropic.com>
</commit_message>
<xml_diff>
--- a/(e)CRF/Per nummer/09b_Werkinstructie drukmeting (SOP Novel pedar).docx
+++ b/(e)CRF/Per nummer/09b_Werkinstructie drukmeting (SOP Novel pedar).docx
@@ -4295,9 +4295,6 @@
             <w:tcW w:type="dxa" w:w="1247"/>
           </w:tcPr>
           <w:p>
-            <w:pPr>
-              <w:keepNext/>
-            </w:pPr>
             <w:r>
               <w:rPr>
                 <w:sz w:val="20"/>
@@ -4312,9 +4309,6 @@
             <w:tcW w:type="dxa" w:w="7540"/>
           </w:tcPr>
           <w:p>
-            <w:pPr>
-              <w:keepNext/>
-            </w:pPr>
             <w:r>
               <w:rPr>
                 <w:sz w:val="20"/>
@@ -4325,36 +4319,6 @@
           </w:p>
         </w:tc>
       </w:tr>
-      <w:tr>
-        <w:tc>
-          <w:tcPr>
-            <w:tcW w:type="dxa" w:w="1247"/>
-          </w:tcPr>
-          <w:p>
-            <w:r>
-              <w:rPr>
-                <w:sz w:val="20"/>
-                <w:lang w:val="nl-BE"/>
-              </w:rPr>
-              <w:t>7</w:t>
-            </w:r>
-          </w:p>
-        </w:tc>
-        <w:tc>
-          <w:tcPr>
-            <w:tcW w:type="dxa" w:w="7540"/>
-          </w:tcPr>
-          <w:p>
-            <w:r>
-              <w:rPr>
-                <w:sz w:val="20"/>
-                <w:lang w:val="nl-BE"/>
-              </w:rPr>
-              <w:t>Blijft leeg tot het masker met de acht regio’s er is</w:t>
-            </w:r>
-          </w:p>
-        </w:tc>
-      </w:tr>
     </w:tbl>
     <w:p/>
     <w:p>
@@ -4379,7 +4343,7 @@
           <w:b/>
           <w:lang w:val="nl-BE"/>
         </w:rPr>
-        <w:t>Kolom D in blok 4, 5 en 7 is de referentie: de piekdruk zonder zool op visite 2. Op visite 2 is dat dezelfde waarde als kolom E; op maand 6, 12 en 18 neem je ze over uit eCRF 24b.</w:t>
+        <w:t>Kolom D in blok 4 en 5 is de referentie: de piekdruk zonder zool op visite 2. Op visite 2 is dat dezelfde waarde als kolom E; op maand 6, 12 en 18 neem je ze over uit eCRF 24b.</w:t>
       </w:r>
     </w:p>
     <w:p>
@@ -5188,243 +5152,6 @@
         <w:t>MVP LF — over de frames waarin minstens één sensor druk registreerde.</w:t>
       </w:r>
     </w:p>
-    <w:p>
-      <w:pPr>
-        <w:keepNext/>
-      </w:pPr>
-      <w:r>
-        <w:rPr>
-          <w:lang w:val="nl-BE"/>
-        </w:rPr>
-        <w:t>Het studieteam verwerkt de geëxporteerde bestanden centraal in de novel database:</w:t>
-      </w:r>
-    </w:p>
-    <w:tbl>
-      <w:tblPr>
-        <w:tblStyle w:val="Tabelraster"/>
-        <w:tblW w:type="auto" w:w="0"/>
-        <w:tblLook w:firstColumn="1" w:firstRow="1" w:lastColumn="0" w:lastRow="0" w:noHBand="0" w:noVBand="1" w:val="04A0"/>
-      </w:tblPr>
-      <w:tblGrid>
-        <w:gridCol w:w="3118"/>
-        <w:gridCol w:w="5669"/>
-      </w:tblGrid>
-      <w:tr>
-        <w:tc>
-          <w:tcPr>
-            <w:tcW w:type="dxa" w:w="3118"/>
-          </w:tcPr>
-          <w:p>
-            <w:pPr>
-              <w:keepNext/>
-            </w:pPr>
-            <w:r>
-              <w:rPr>
-                <w:b/>
-                <w:color w:val="123A5F"/>
-                <w:sz w:val="20"/>
-                <w:lang w:val="nl-BE"/>
-              </w:rPr>
-              <w:t>Programma</w:t>
-            </w:r>
-          </w:p>
-        </w:tc>
-        <w:tc>
-          <w:tcPr>
-            <w:tcW w:type="dxa" w:w="5669"/>
-          </w:tcPr>
-          <w:p>
-            <w:pPr>
-              <w:keepNext/>
-            </w:pPr>
-            <w:r>
-              <w:rPr>
-                <w:b/>
-                <w:color w:val="123A5F"/>
-                <w:sz w:val="20"/>
-                <w:lang w:val="nl-BE"/>
-              </w:rPr>
-              <w:t>Wat het doet</w:t>
-            </w:r>
-          </w:p>
-        </w:tc>
-      </w:tr>
-      <w:tr>
-        <w:tc>
-          <w:tcPr>
-            <w:tcW w:type="dxa" w:w="3118"/>
-          </w:tcPr>
-          <w:p>
-            <w:pPr>
-              <w:keepNext/>
-            </w:pPr>
-            <w:r>
-              <w:rPr>
-                <w:sz w:val="20"/>
-                <w:lang w:val="nl-BE"/>
-              </w:rPr>
-              <w:t>pedar step analysis</w:t>
-            </w:r>
-          </w:p>
-        </w:tc>
-        <w:tc>
-          <w:tcPr>
-            <w:tcW w:type="dxa" w:w="5669"/>
-          </w:tcPr>
-          <w:p>
-            <w:pPr>
-              <w:keepNext/>
-            </w:pPr>
-            <w:r>
-              <w:rPr>
-                <w:sz w:val="20"/>
-                <w:lang w:val="nl-BE"/>
-              </w:rPr>
-              <w:t>Toont de afzonderlijke stappen, links en rechts</w:t>
-            </w:r>
-          </w:p>
-        </w:tc>
-      </w:tr>
-      <w:tr>
-        <w:tc>
-          <w:tcPr>
-            <w:tcW w:type="dxa" w:w="3118"/>
-          </w:tcPr>
-          <w:p>
-            <w:pPr>
-              <w:keepNext/>
-            </w:pPr>
-            <w:r>
-              <w:rPr>
-                <w:sz w:val="20"/>
-                <w:lang w:val="nl-BE"/>
-              </w:rPr>
-              <w:t>file master</w:t>
-            </w:r>
-          </w:p>
-        </w:tc>
-        <w:tc>
-          <w:tcPr>
-            <w:tcW w:type="dxa" w:w="5669"/>
-          </w:tcPr>
-          <w:p>
-            <w:pPr>
-              <w:keepNext/>
-            </w:pPr>
-            <w:r>
-              <w:rPr>
-                <w:sz w:val="20"/>
-                <w:lang w:val="nl-BE"/>
-              </w:rPr>
-              <w:t>Knipt frames weg tussen twee markers: aanloop, uitloop, keren, pauzes</w:t>
-            </w:r>
-          </w:p>
-        </w:tc>
-      </w:tr>
-      <w:tr>
-        <w:tc>
-          <w:tcPr>
-            <w:tcW w:type="dxa" w:w="3118"/>
-          </w:tcPr>
-          <w:p>
-            <w:pPr>
-              <w:keepNext/>
-            </w:pPr>
-            <w:r>
-              <w:rPr>
-                <w:sz w:val="20"/>
-                <w:lang w:val="nl-BE"/>
-              </w:rPr>
-              <w:t>creation of any and percent masks</w:t>
-            </w:r>
-          </w:p>
-        </w:tc>
-        <w:tc>
-          <w:tcPr>
-            <w:tcW w:type="dxa" w:w="5669"/>
-          </w:tcPr>
-          <w:p>
-            <w:pPr>
-              <w:keepNext/>
-            </w:pPr>
-            <w:r>
-              <w:rPr>
-                <w:sz w:val="20"/>
-                <w:lang w:val="nl-BE"/>
-              </w:rPr>
-              <w:t>Tekent de acht regio’s van het protocol als masker op de zool</w:t>
-            </w:r>
-          </w:p>
-        </w:tc>
-      </w:tr>
-      <w:tr>
-        <w:tc>
-          <w:tcPr>
-            <w:tcW w:type="dxa" w:w="3118"/>
-          </w:tcPr>
-          <w:p>
-            <w:pPr>
-              <w:keepNext/>
-            </w:pPr>
-            <w:r>
-              <w:rPr>
-                <w:sz w:val="20"/>
-                <w:lang w:val="nl-BE"/>
-              </w:rPr>
-              <w:t>multimask evaluation</w:t>
-            </w:r>
-          </w:p>
-        </w:tc>
-        <w:tc>
-          <w:tcPr>
-            <w:tcW w:type="dxa" w:w="5669"/>
-          </w:tcPr>
-          <w:p>
-            <w:pPr>
-              <w:keepNext/>
-            </w:pPr>
-            <w:r>
-              <w:rPr>
-                <w:sz w:val="20"/>
-                <w:lang w:val="nl-BE"/>
-              </w:rPr>
-              <w:t>Rekent de piekdruk per regio voor één meting</w:t>
-            </w:r>
-          </w:p>
-        </w:tc>
-      </w:tr>
-      <w:tr>
-        <w:tc>
-          <w:tcPr>
-            <w:tcW w:type="dxa" w:w="3118"/>
-          </w:tcPr>
-          <w:p>
-            <w:r>
-              <w:rPr>
-                <w:sz w:val="20"/>
-                <w:lang w:val="nl-BE"/>
-              </w:rPr>
-              <w:t>groupmask evaluation</w:t>
-            </w:r>
-          </w:p>
-        </w:tc>
-        <w:tc>
-          <w:tcPr>
-            <w:tcW w:type="dxa" w:w="5669"/>
-          </w:tcPr>
-          <w:p>
-            <w:r>
-              <w:rPr>
-                <w:sz w:val="20"/>
-                <w:lang w:val="nl-BE"/>
-              </w:rPr>
-              <w:t>Hetzelfde over alle metingen van de studie</w:t>
-            </w:r>
-          </w:p>
-        </w:tc>
-      </w:tr>
-    </w:tbl>
-    <w:p/>
     <w:p>
       <w:pPr>
         <w:keepNext/>
@@ -5955,7 +5682,7 @@
         <w:sz w:val="16"/>
         <w:lang w:val="nl-BE"/>
       </w:rPr>
-      <w:t xml:space="preserve">PARADISE-studie  ·  eCRF 09b: Werkinstructie drukmeting (SOP Novel pedar) ·  Versie 1.3  ·  25/09/2026  ·  Pagina </w:t>
+      <w:t xml:space="preserve">PARADISE-studie  ·  eCRF 09b: Werkinstructie drukmeting (SOP Novel pedar) ·  Versie 1.4  ·  25/09/2026  ·  Pagina </w:t>
     </w:r>
     <w:r>
       <w:rPr>

</xml_diff>

<commit_message>
Doelregio's: minder als er minder boven 200 kPa liggen; waaktijd in beide armen
- 09b, eCRF 09 en 24 (alle kopieen), REDCap-kop en manuscript: per voet de vorige
  voetzweer plus de regio's boven 200 kPa, hoogstens drie; liggen er minder boven
  200 kPa, dan minder doelregio's (beslist 26/09/2026).
- eCRF 25b (alle kopieen): Hours/day uit het MoveMonitorrapport via de draagtijdtool,
  in beide armen.
- Protocol: 100 dagen is de opslagcapaciteit van de Orthotimer, niet de batterij.
- eCRF 17: voorbeeld 12 uur per dag in plaats van 16 uur (80% van de waaktijd).
- PARADISE_BRONNEN: beslissingen en de oorsprong van de 80%-drempel (DIAFOS).

Co-Authored-By: Claude Opus 5.5 <noreply@anthropic.com>
</commit_message>
<xml_diff>
--- a/(e)CRF/Per nummer/09b_Werkinstructie drukmeting (SOP Novel pedar).docx
+++ b/(e)CRF/Per nummer/09b_Werkinstructie drukmeting (SOP Novel pedar).docx
@@ -3567,7 +3567,7 @@
         <w:rPr>
           <w:lang w:val="nl-BE"/>
         </w:rPr>
-        <w:t>Noteer in blok 4 per voet drie regio’s met hun piekdruk:</w:t>
+        <w:t>Noteer in blok 4 per voet de doelregio’s, hoogstens drie, met hun piekdruk:</w:t>
       </w:r>
     </w:p>
     <w:p>
@@ -3591,7 +3591,7 @@
         <w:rPr>
           <w:lang w:val="nl-BE"/>
         </w:rPr>
-        <w:t>dan de twee regio’s in voorvoet of middenvoet met de hoogste piekdruk. De hiel telt niet mee, tenzij daar de vorige voetzweer zat.</w:t>
+        <w:t>dan de twee regio’s in voorvoet of middenvoet met de hoogste piekdruk boven 200 kPa. Liggen er minder regio’s boven 200 kPa, dan duid je er minder aan. De hiel telt niet mee, tenzij daar de vorige voetzweer zat.</w:t>
       </w:r>
     </w:p>
     <w:p>
@@ -3599,7 +3599,7 @@
         <w:rPr>
           <w:lang w:val="nl-BE"/>
         </w:rPr>
-        <w:t>Regio’s: hiel, mediale middenvoet, laterale middenvoet, metatarsaal 1, metatarsaal 2-3, metatarsaal 4-5, hallux, tenen 2-5. Dezelfde drie duid je op visite 2 aan als doelregio’s op eCRF 24, vóór je B meet; op maand 6, 12 en 18 neem je ze over van het vorige formulier.</w:t>
+        <w:t>Regio’s: hiel, mediale middenvoet, laterale middenvoet, metatarsaal 1, metatarsaal 2-3, metatarsaal 4-5, hallux, tenen 2-5. Dezelfde duid je op visite 2 aan als doelregio’s op eCRF 24, vóór je B meet; op maand 6, 12 en 18 neem je ze over van het vorige formulier.</w:t>
       </w:r>
     </w:p>
     <w:p>
@@ -4248,7 +4248,7 @@
                 <w:sz w:val="20"/>
                 <w:lang w:val="nl-BE"/>
               </w:rPr>
-              <w:t>De drie regio’s per voet, met de referentie van visite 2 en de piekdruk zonder en met zool; % lager dan referentie en Norm gehaald? rekenen zelf</w:t>
+              <w:t>De doelregio’s per voet, met de referentie van visite 2 en de piekdruk zonder en met zool; % lager dan referentie en Norm gehaald? rekenen zelf</w:t>
             </w:r>
           </w:p>
         </w:tc>
@@ -4284,7 +4284,7 @@
                 <w:sz w:val="20"/>
                 <w:lang w:val="nl-BE"/>
               </w:rPr>
-              <w:t>De drie doelregio’s, met dezelfde kolommen, en of de druk met 5% of meer gestegen is</w:t>
+              <w:t>De doelregio’s, met dezelfde kolommen, en of de druk met 5% of meer gestegen is</w:t>
             </w:r>
           </w:p>
         </w:tc>

</xml_diff>

<commit_message>
Usual Care: drukmeting alleen op baseline en maand 6, geblindeerd met drempel 50 kPa; SOP's met een uniforme deelnemerscode
SOP Novel pedar (09b): Usual Care alleen visite 1 en maand 6, tweede palet met Pressure Cut Off 50 kPa en waarden uit,
waarden centraal; DIAFOS bij de bronnen. SOP MoveMonitor (19b) en Orthotimer (25b): deelnemerscode zonder voorvoegsel en
1/1/1900 in alle software. Alle kopieen. Opleidingsplanning en zakkaart (PEDIS 1-2; teen- of halluxamputatie, resectie van
een of meer metatarsaalkopjes) mee. BRONNEN: beslissing 8/10, bronnen van de doelregio's, en de correctie dat 09b de
referentie per sessie nog niet heeft. CLAUDE.md: Usual Care-meting.

Co-Authored-By: Claude Opus 5.5 <noreply@anthropic.com>
</commit_message>
<xml_diff>
--- a/(e)CRF/Per nummer/09b_Werkinstructie drukmeting (SOP Novel pedar).docx
+++ b/(e)CRF/Per nummer/09b_Werkinstructie drukmeting (SOP Novel pedar).docx
@@ -407,7 +407,7 @@
         <w:rPr>
           <w:lang w:val="nl-BE"/>
         </w:rPr>
-        <w:t>Beide armen worden zo gemeten. In Optimal Care stuurt de meting de aanpassing van de CMFO; in Usual Care is ze geblindeerd (hoofdstuk 10).</w:t>
+        <w:t xml:space="preserve">In Optimal Care meet je op al deze momenten; de meting stuurt de aanpassing van de CMFO. In Usual Care meet je alleen op visite 1 (A) en op maand 6 (visite 4, A en B), geblindeerd (hoofdstuk 10); op visite 2 en op maand 12 en 18 is er in Usual Care geen drukmeting.</w:t>
       </w:r>
     </w:p>
     <w:p>
@@ -816,7 +816,7 @@
           <w:b/>
           <w:lang w:val="nl-BE"/>
         </w:rPr>
-        <w:t>Gebruik altijd dit palet, voor elke deelnemer en elke visite. Een ander palet geeft dezelfde druk een andere kleur (figuur 4).</w:t>
+        <w:t xml:space="preserve">Gebruik in Optimal Care altijd dit palet, voor elke deelnemer en elke visite. Een ander palet geeft dezelfde druk een andere kleur (figuur 4). Voor Usual Care bewaar je een tweede palet, met Pressure Cut Off op 50 kPa (hoofdstuk 10).</w:t>
       </w:r>
     </w:p>
     <w:p>
@@ -4066,7 +4066,7 @@
           <w:b/>
           <w:lang w:val="nl-BE"/>
         </w:rPr>
-        <w:t>In Usual Care meet en noteer je alles op dezelfde manier, maar je toetst niet aan de norm. Toon het scherm niet aan deelnemer of pedorthist, bespreek de waarden niet en laat de CMFO niet aanpassen op basis van de meting.</w:t>
+        <w:t xml:space="preserve">In Usual Care meet je alleen op visite 1 en op maand 6. Kies vooraf het tweede palet, met de drempel (Pressure Cut Off) op 50 kPa, en zet de waarden in de cellen uit: zo kan de meting niet sturen en vermijd je bias. Lees niets af en toets niet aan de norm; het studieteam bepaalt de doelregio's en haalt de waarden centraal uit het exportbestand. Toon het scherm niet aan deelnemer of pedorthist, bespreek de meting niet en laat de CMFO niet aanpassen op basis van de meting.</w:t>
       </w:r>
     </w:p>
     <w:p>
@@ -5590,6 +5590,19 @@
           <w:lang w:val="nl-BE"/>
         </w:rPr>
         <w:t>Bus SA, Haspels R, Busch-Westbroek TE. Evaluation and optimization of therapeutic footwear for neuropathic diabetic foot patients using in-shoe plantar pressure analysis. Diabetes Care. 2011;34(7):1595-600. doi:10.2337/dc10-2206</w:t>
+      </w:r>
+    </w:p>
+    <w:p>
+      <w:pPr>
+        <w:pStyle w:val="Lijstopsomteken"/>
+        <w:ind w:left="680"/>
+      </w:pPr>
+      <w:r>
+        <w:rPr>
+          <w:sz w:val="17"/>
+          <w:lang w:val="nl-BE"/>
+        </w:rPr>
+        <w:t xml:space="preserve">Bus SA, Waaijman R, Arts M, de Haart M, Busch-Westbroek T, van Baal J, Nollet F. Effect of custom-made footwear on foot ulcer recurrence in diabetes: a multicenter randomized controlled trial. Diabetes Care. 2013;36:4109-16. doi:10.2337/dc13-0996. De keuze van de doelregio's (de vorige ulcuslocatie en per voet de twee voor- of middenvoetregio's met de hoogste piekdruk boven 200 kPa), de norm en de drie aanpassingsrondes volgen deze studie.</w:t>
       </w:r>
     </w:p>
     <w:p>

</xml_diff>

<commit_message>
SOP 09b: de 25% tegenover A van dezelfde sessie, tot drie aanpassingen; blok 4 en 5 volgen de nieuwe drukmeettool
Co-Authored-By: Claude Opus 5.5 <noreply@anthropic.com>
</commit_message>
<xml_diff>
--- a/(e)CRF/Per nummer/09b_Werkinstructie drukmeting (SOP Novel pedar).docx
+++ b/(e)CRF/Per nummer/09b_Werkinstructie drukmeting (SOP Novel pedar).docx
@@ -303,7 +303,7 @@
                 <w:sz w:val="20"/>
                 <w:lang w:val="nl-BE"/>
               </w:rPr>
-              <w:t>ja; dit is de vaste referentie voor de hele studie</w:t>
+              <w:t>ja; de referentie voor de 25% van deze sessie</w:t>
             </w:r>
           </w:p>
         </w:tc>
@@ -320,7 +320,7 @@
                 <w:sz w:val="20"/>
                 <w:lang w:val="nl-BE"/>
               </w:rPr>
-              <w:t>ja, en in Optimal Care opnieuw na elke aanpassing tot de norm gehaald is</w:t>
+              <w:t>ja, en in Optimal Care opnieuw na elke aanpassing, tot drie aanpassingen</w:t>
             </w:r>
           </w:p>
         </w:tc>
@@ -367,7 +367,7 @@
                 <w:sz w:val="20"/>
                 <w:lang w:val="nl-BE"/>
               </w:rPr>
-              <w:t>ja; toont de actuele druk zonder bescherming, maar is niet de referentie</w:t>
+              <w:t>ja; opnieuw de referentie voor de 25% van deze sessie</w:t>
             </w:r>
           </w:p>
         </w:tc>
@@ -415,7 +415,7 @@
         <w:rPr>
           <w:lang w:val="nl-BE"/>
         </w:rPr>
-        <w:t>De norm per doelregio: piekdruk mét de CMFO onder 200 kPa, óf minstens 25% lager dan de basismeting van visite 2.</w:t>
+        <w:t>De norm per doelregio: piekdruk mét de CMFO onder 200 kPa, óf minstens 25% lager dan zónder de CMFO in dezelfde sessie.</w:t>
       </w:r>
     </w:p>
     <w:p>
@@ -3168,7 +3168,7 @@
         <w:rPr>
           <w:lang w:val="nl-BE"/>
         </w:rPr>
-        <w:t>Eerst A, zonder de CMFO; dan B, met de CMFO en de pedar-zool erbovenop. Op maand 6, 12 en 18 meet je A opnieuw, maar de 25% reken je altijd tegenover A van visite 2. Op visite 1 meet je alleen A, drie keer na elkaar.</w:t>
+        <w:t>Eerst A, zonder de CMFO; dan B, met de CMFO en de pedar-zool erbovenop. Op elke meetvisite reken je de 25% tegenover A van dezelfde sessie. Op visite 1 meet je alleen A, drie keer na elkaar.</w:t>
       </w:r>
     </w:p>
     <w:p>
@@ -3667,7 +3667,7 @@
         <w:rPr>
           <w:lang w:val="nl-BE"/>
         </w:rPr>
-        <w:t>zo niet: minstens 25% lager dan de basismeting van visite 2: ook gehaald.</w:t>
+        <w:t>zo niet: minstens 25% lager dan A van dezelfde sessie: ook gehaald.</w:t>
       </w:r>
     </w:p>
     <w:p>
@@ -3675,7 +3675,7 @@
         <w:rPr>
           <w:lang w:val="nl-BE"/>
         </w:rPr>
-        <w:t>Verlaging in % = (basismeting visite 2 − meting mét CMFO) ÷ basismeting visite 2 × 100</w:t>
+        <w:t>Verlaging in % = (A − B) ÷ A × 100, met A en B uit dezelfde sessie</w:t>
       </w:r>
     </w:p>
     <w:tbl>
@@ -3707,7 +3707,7 @@
                 <w:sz w:val="20"/>
                 <w:lang w:val="nl-BE"/>
               </w:rPr>
-              <w:t>Basismeting visite 2</w:t>
+              <w:t>Zónder CMFO (A)</w:t>
             </w:r>
           </w:p>
         </w:tc>
@@ -3726,7 +3726,7 @@
                 <w:sz w:val="20"/>
                 <w:lang w:val="nl-BE"/>
               </w:rPr>
-              <w:t>Mét CMFO</w:t>
+              <w:t>Mét CMFO (B)</w:t>
             </w:r>
           </w:p>
         </w:tc>
@@ -4041,7 +4041,7 @@
         <w:rPr>
           <w:lang w:val="nl-BE"/>
         </w:rPr>
-        <w:t>Niet gehaald op een doelregio: de pedorthist past aan en je meet B opnieuw. Aanpassen kan ook als de 25% gehaald is maar de druk boven 200 kPa blijft, of als de druk 5% of meer gestegen is tegenover de vorige meting.</w:t>
+        <w:t>Niet gehaald op een doelregio: de pedorthist past aan en je meet B opnieuw, tot drie aanpassingen (eCRF 24: extra ontlastingstest 1 tot 3). Aanpassen kan ook als de 25% gehaald is maar de druk boven 200 kPa blijft, of als de druk 5% of meer gestegen is tegenover de vorige meting.</w:t>
       </w:r>
     </w:p>
     <w:p>
@@ -4248,7 +4248,7 @@
                 <w:sz w:val="20"/>
                 <w:lang w:val="nl-BE"/>
               </w:rPr>
-              <w:t>De doelregio’s per voet, met de referentie van visite 2 en de piekdruk zonder en met zool; % lager dan referentie en Norm gehaald? rekenen zelf</w:t>
+              <w:t>De doelregio’s per voet, met de piekdruk met zool van de vorige meting en die zonder en met zool van deze sessie; % lager dan zonder zool, Norm gehaald? en de stijging rekenen zelf</w:t>
             </w:r>
           </w:p>
         </w:tc>
@@ -4343,7 +4343,7 @@
           <w:b/>
           <w:lang w:val="nl-BE"/>
         </w:rPr>
-        <w:t>Kolom D in blok 4 en 5 is de referentie: de piekdruk zonder zool op visite 2. Op visite 2 is dat dezelfde waarde als kolom E; op maand 6, 12 en 18 neem je ze over uit eCRF 24b.</w:t>
+        <w:t>Kolom E in blok 4 en 5 is de referentie: de piekdruk zonder zool van deze sessie. Kolom D is de piekdruk met zool van de vorige meting, over te nemen uit eCRF 24b (leeg op visite 2); daarmee rekent kolom I de stijging van 5%.</w:t>
       </w:r>
     </w:p>
     <w:p>

</xml_diff>